<commit_message>
fix: remove references in the templates file
</commit_message>
<xml_diff>
--- a/src/modules/paper_versions/templates/IMRAD Template.docx
+++ b/src/modules/paper_versions/templates/IMRAD Template.docx
@@ -265,27 +265,7 @@
           <w:sz w:val="24"/>
           <w:szCs w:val="24"/>
         </w:rPr>
-        <w:t>[Program Name (</w:t>
-      </w:r>
-      <w:proofErr w:type="spellStart"/>
-      <w:proofErr w:type="gramStart"/>
-      <w:r>
-        <w:rPr>
-          <w:rFonts w:ascii="Times New Roman" w:eastAsia="Times New Roman" w:hAnsi="Times New Roman" w:cs="Times New Roman"/>
-          <w:sz w:val="24"/>
-          <w:szCs w:val="24"/>
-        </w:rPr>
-        <w:t>ex:Bachelor</w:t>
-      </w:r>
-      <w:proofErr w:type="spellEnd"/>
-      <w:proofErr w:type="gramEnd"/>
-      <w:r>
-        <w:rPr>
-          <w:rFonts w:ascii="Times New Roman" w:eastAsia="Times New Roman" w:hAnsi="Times New Roman" w:cs="Times New Roman"/>
-          <w:sz w:val="24"/>
-          <w:szCs w:val="24"/>
-        </w:rPr>
-        <w:t xml:space="preserve"> of science in computer science)]</w:t>
+        <w:t>[Program Name (ex:Bachelor of science in computer science)]</w:t>
       </w:r>
     </w:p>
     <w:p>
@@ -349,23 +329,7 @@
           <w:sz w:val="24"/>
           <w:szCs w:val="24"/>
         </w:rPr>
-        <w:t xml:space="preserve"> [College Name (ex: </w:t>
-      </w:r>
-      <w:r>
-        <w:rPr>
-          <w:rFonts w:ascii="Times New Roman" w:eastAsia="Times New Roman" w:hAnsi="Times New Roman" w:cs="Times New Roman"/>
-          <w:sz w:val="24"/>
-          <w:szCs w:val="24"/>
-        </w:rPr>
-        <w:t>College of Computer and Information Science</w:t>
-      </w:r>
-      <w:r>
-        <w:rPr>
-          <w:rFonts w:ascii="Times New Roman" w:eastAsia="Times New Roman" w:hAnsi="Times New Roman" w:cs="Times New Roman"/>
-          <w:sz w:val="24"/>
-          <w:szCs w:val="24"/>
-        </w:rPr>
-        <w:t>)]</w:t>
+        <w:t xml:space="preserve"> [College Name (ex: College of Computer and Information Science)]</w:t>
       </w:r>
     </w:p>
     <w:p>
@@ -1040,7 +1004,6 @@
           <w:szCs w:val="24"/>
         </w:rPr>
       </w:pPr>
-      <w:proofErr w:type="gramStart"/>
       <w:r>
         <w:rPr>
           <w:rFonts w:ascii="Times New Roman" w:eastAsia="Times New Roman" w:hAnsi="Times New Roman" w:cs="Times New Roman"/>
@@ -1057,16 +1020,7 @@
           <w:sz w:val="24"/>
           <w:szCs w:val="24"/>
         </w:rPr>
-        <w:t>[</w:t>
-      </w:r>
-      <w:proofErr w:type="gramEnd"/>
-      <w:r>
-        <w:rPr>
-          <w:rFonts w:ascii="Times New Roman" w:eastAsia="Times New Roman" w:hAnsi="Times New Roman" w:cs="Times New Roman"/>
-          <w:sz w:val="24"/>
-          <w:szCs w:val="24"/>
-        </w:rPr>
-        <w:t>Subtitle]</w:t>
+        <w:t>[Subtitle]</w:t>
       </w:r>
     </w:p>
     <w:p>
@@ -1241,418 +1195,6 @@
         </w:rPr>
         <w:lastRenderedPageBreak/>
         <w:t>References</w:t>
-      </w:r>
-    </w:p>
-    <w:p>
-      <w:pPr>
-        <w:spacing w:after="160" w:line="480" w:lineRule="auto"/>
-        <w:ind w:left="850" w:hanging="850"/>
-        <w:rPr>
-          <w:rFonts w:ascii="Times New Roman" w:eastAsia="Times New Roman" w:hAnsi="Times New Roman" w:cs="Times New Roman"/>
-          <w:sz w:val="24"/>
-          <w:szCs w:val="24"/>
-        </w:rPr>
-      </w:pPr>
-      <w:proofErr w:type="spellStart"/>
-      <w:r>
-        <w:rPr>
-          <w:rFonts w:ascii="Times New Roman" w:eastAsia="Times New Roman" w:hAnsi="Times New Roman" w:cs="Times New Roman"/>
-          <w:sz w:val="24"/>
-          <w:szCs w:val="24"/>
-        </w:rPr>
-        <w:t>Aniegwu</w:t>
-      </w:r>
-      <w:proofErr w:type="spellEnd"/>
-      <w:r>
-        <w:rPr>
-          <w:rFonts w:ascii="Times New Roman" w:eastAsia="Times New Roman" w:hAnsi="Times New Roman" w:cs="Times New Roman"/>
-          <w:sz w:val="24"/>
-          <w:szCs w:val="24"/>
-        </w:rPr>
-        <w:t xml:space="preserve">, G. E., </w:t>
-      </w:r>
-      <w:proofErr w:type="spellStart"/>
-      <w:r>
-        <w:rPr>
-          <w:rFonts w:ascii="Times New Roman" w:eastAsia="Times New Roman" w:hAnsi="Times New Roman" w:cs="Times New Roman"/>
-          <w:sz w:val="24"/>
-          <w:szCs w:val="24"/>
-        </w:rPr>
-        <w:t>Onyesolu</w:t>
-      </w:r>
-      <w:proofErr w:type="spellEnd"/>
-      <w:r>
-        <w:rPr>
-          <w:rFonts w:ascii="Times New Roman" w:eastAsia="Times New Roman" w:hAnsi="Times New Roman" w:cs="Times New Roman"/>
-          <w:sz w:val="24"/>
-          <w:szCs w:val="24"/>
-        </w:rPr>
-        <w:t xml:space="preserve">, M. O., </w:t>
-      </w:r>
-      <w:proofErr w:type="spellStart"/>
-      <w:r>
-        <w:rPr>
-          <w:rFonts w:ascii="Times New Roman" w:eastAsia="Times New Roman" w:hAnsi="Times New Roman" w:cs="Times New Roman"/>
-          <w:sz w:val="24"/>
-          <w:szCs w:val="24"/>
-        </w:rPr>
-        <w:t>Onyenwe</w:t>
-      </w:r>
-      <w:proofErr w:type="spellEnd"/>
-      <w:r>
-        <w:rPr>
-          <w:rFonts w:ascii="Times New Roman" w:eastAsia="Times New Roman" w:hAnsi="Times New Roman" w:cs="Times New Roman"/>
-          <w:sz w:val="24"/>
-          <w:szCs w:val="24"/>
-        </w:rPr>
-        <w:t xml:space="preserve">, I. E., &amp; </w:t>
-      </w:r>
-      <w:proofErr w:type="spellStart"/>
-      <w:r>
-        <w:rPr>
-          <w:rFonts w:ascii="Times New Roman" w:eastAsia="Times New Roman" w:hAnsi="Times New Roman" w:cs="Times New Roman"/>
-          <w:sz w:val="24"/>
-          <w:szCs w:val="24"/>
-        </w:rPr>
-        <w:t>Ugoh</w:t>
-      </w:r>
-      <w:proofErr w:type="spellEnd"/>
-      <w:r>
-        <w:rPr>
-          <w:rFonts w:ascii="Times New Roman" w:eastAsia="Times New Roman" w:hAnsi="Times New Roman" w:cs="Times New Roman"/>
-          <w:sz w:val="24"/>
-          <w:szCs w:val="24"/>
-        </w:rPr>
-        <w:t xml:space="preserve">, D. (2022). A Web-Based Parent-Teacher collaborative system for monitoring students’ academic performances in Nigerian schools. OALib, 09(06), 1–16. https://www.scirp.org/journal/paperinformation?paperid=117856   </w:t>
-      </w:r>
-    </w:p>
-    <w:p>
-      <w:pPr>
-        <w:spacing w:after="160" w:line="480" w:lineRule="auto"/>
-        <w:ind w:left="850" w:hanging="850"/>
-        <w:rPr>
-          <w:rFonts w:ascii="Times New Roman" w:eastAsia="Times New Roman" w:hAnsi="Times New Roman" w:cs="Times New Roman"/>
-          <w:sz w:val="24"/>
-          <w:szCs w:val="24"/>
-        </w:rPr>
-      </w:pPr>
-      <w:r>
-        <w:rPr>
-          <w:rFonts w:ascii="Times New Roman" w:eastAsia="Times New Roman" w:hAnsi="Times New Roman" w:cs="Times New Roman"/>
-          <w:sz w:val="24"/>
-          <w:szCs w:val="24"/>
-        </w:rPr>
-        <w:t>‌Bracken, B. (2022). The risks of fragmented document management. Storm Technology. https://www.storm.ie/insights/insights/risks-of-fragmented-document-management/</w:t>
-      </w:r>
-    </w:p>
-    <w:p>
-      <w:pPr>
-        <w:spacing w:after="160" w:line="480" w:lineRule="auto"/>
-        <w:ind w:left="850" w:hanging="850"/>
-        <w:rPr>
-          <w:rFonts w:ascii="Times New Roman" w:eastAsia="Times New Roman" w:hAnsi="Times New Roman" w:cs="Times New Roman"/>
-          <w:sz w:val="24"/>
-          <w:szCs w:val="24"/>
-        </w:rPr>
-      </w:pPr>
-      <w:r>
-        <w:rPr>
-          <w:rFonts w:ascii="Times New Roman" w:eastAsia="Times New Roman" w:hAnsi="Times New Roman" w:cs="Times New Roman"/>
-          <w:sz w:val="24"/>
-          <w:szCs w:val="24"/>
-        </w:rPr>
-        <w:t xml:space="preserve">Radmila </w:t>
-      </w:r>
-      <w:proofErr w:type="spellStart"/>
-      <w:r>
-        <w:rPr>
-          <w:rFonts w:ascii="Times New Roman" w:eastAsia="Times New Roman" w:hAnsi="Times New Roman" w:cs="Times New Roman"/>
-          <w:sz w:val="24"/>
-          <w:szCs w:val="24"/>
-        </w:rPr>
-        <w:t>Razlog</w:t>
-      </w:r>
-      <w:proofErr w:type="spellEnd"/>
-      <w:r>
-        <w:rPr>
-          <w:rFonts w:ascii="Times New Roman" w:eastAsia="Times New Roman" w:hAnsi="Times New Roman" w:cs="Times New Roman"/>
-          <w:sz w:val="24"/>
-          <w:szCs w:val="24"/>
-        </w:rPr>
-        <w:t xml:space="preserve">, &amp; Hu, Z. (2024). Exploring students’ experiences on a capstone project in health sciences higher education: A South African case study. International Journal of Learning Teaching and Educational Research, 23(6), 604–619. https://doi.org/10.26803/ijlter.23.6.28  </w:t>
-      </w:r>
-    </w:p>
-    <w:p>
-      <w:pPr>
-        <w:spacing w:after="160" w:line="480" w:lineRule="auto"/>
-        <w:ind w:left="850" w:hanging="850"/>
-        <w:rPr>
-          <w:rFonts w:ascii="Times New Roman" w:eastAsia="Times New Roman" w:hAnsi="Times New Roman" w:cs="Times New Roman"/>
-          <w:sz w:val="24"/>
-          <w:szCs w:val="24"/>
-        </w:rPr>
-      </w:pPr>
-      <w:r>
-        <w:rPr>
-          <w:rFonts w:ascii="Times New Roman" w:eastAsia="Times New Roman" w:hAnsi="Times New Roman" w:cs="Times New Roman"/>
-          <w:sz w:val="24"/>
-          <w:szCs w:val="24"/>
-        </w:rPr>
-        <w:t xml:space="preserve">Saracostti, M., De Toro, X., Rossi, A., Lara, L., &amp; Sotomayor, M. B. (2022). Implementation of a web-based system to measure, monitor, and promote school engagement strategies. A Chilean experience. Frontiers in Psychology, 13, 980902. https://doi.org/10.3389/fpsyg.2022.980902 </w:t>
-      </w:r>
-    </w:p>
-    <w:p>
-      <w:pPr>
-        <w:spacing w:line="480" w:lineRule="auto"/>
-        <w:ind w:left="850" w:hanging="850"/>
-        <w:rPr>
-          <w:rFonts w:ascii="Times New Roman" w:eastAsia="Times New Roman" w:hAnsi="Times New Roman" w:cs="Times New Roman"/>
-          <w:sz w:val="24"/>
-          <w:szCs w:val="24"/>
-        </w:rPr>
-      </w:pPr>
-      <w:r>
-        <w:rPr>
-          <w:rFonts w:ascii="Times New Roman" w:eastAsia="Times New Roman" w:hAnsi="Times New Roman" w:cs="Times New Roman"/>
-          <w:sz w:val="24"/>
-          <w:szCs w:val="24"/>
-        </w:rPr>
-        <w:t xml:space="preserve">Altmann, M., &amp; Arnold, M. (2024). Designing formative feedback in collaborative online international learning. </w:t>
-      </w:r>
-      <w:r>
-        <w:rPr>
-          <w:rFonts w:ascii="Times New Roman" w:eastAsia="Times New Roman" w:hAnsi="Times New Roman" w:cs="Times New Roman"/>
-          <w:i/>
-          <w:iCs/>
-          <w:sz w:val="24"/>
-          <w:szCs w:val="24"/>
-        </w:rPr>
-        <w:t>Human Systems Management</w:t>
-      </w:r>
-      <w:r>
-        <w:rPr>
-          <w:rFonts w:ascii="Times New Roman" w:eastAsia="Times New Roman" w:hAnsi="Times New Roman" w:cs="Times New Roman"/>
-          <w:sz w:val="24"/>
-          <w:szCs w:val="24"/>
-        </w:rPr>
-        <w:t>, 1–18. https://doi.org/10.3233/hsm-230100</w:t>
-      </w:r>
-    </w:p>
-    <w:p>
-      <w:pPr>
-        <w:spacing w:line="480" w:lineRule="auto"/>
-        <w:ind w:left="850" w:hanging="850"/>
-        <w:rPr>
-          <w:rFonts w:ascii="Times New Roman" w:eastAsia="Times New Roman" w:hAnsi="Times New Roman" w:cs="Times New Roman"/>
-          <w:sz w:val="24"/>
-          <w:szCs w:val="24"/>
-        </w:rPr>
-      </w:pPr>
-      <w:r>
-        <w:rPr>
-          <w:rFonts w:ascii="Times New Roman" w:eastAsia="Times New Roman" w:hAnsi="Times New Roman" w:cs="Times New Roman"/>
-          <w:sz w:val="24"/>
-          <w:szCs w:val="24"/>
-        </w:rPr>
-        <w:t xml:space="preserve">Nafiseh Taghizadeh Kerman, Seyyed Kazem </w:t>
-      </w:r>
-      <w:proofErr w:type="spellStart"/>
-      <w:r>
-        <w:rPr>
-          <w:rFonts w:ascii="Times New Roman" w:eastAsia="Times New Roman" w:hAnsi="Times New Roman" w:cs="Times New Roman"/>
-          <w:sz w:val="24"/>
-          <w:szCs w:val="24"/>
-        </w:rPr>
-        <w:t>Banihashem</w:t>
-      </w:r>
-      <w:proofErr w:type="spellEnd"/>
-      <w:r>
-        <w:rPr>
-          <w:rFonts w:ascii="Times New Roman" w:eastAsia="Times New Roman" w:hAnsi="Times New Roman" w:cs="Times New Roman"/>
-          <w:sz w:val="24"/>
-          <w:szCs w:val="24"/>
-        </w:rPr>
-        <w:t xml:space="preserve">, Karami, M., Er, E., Stan van Ginkel, &amp; Omid </w:t>
-      </w:r>
-      <w:proofErr w:type="spellStart"/>
-      <w:r>
-        <w:rPr>
-          <w:rFonts w:ascii="Times New Roman" w:eastAsia="Times New Roman" w:hAnsi="Times New Roman" w:cs="Times New Roman"/>
-          <w:sz w:val="24"/>
-          <w:szCs w:val="24"/>
-        </w:rPr>
-        <w:t>Noroozi</w:t>
-      </w:r>
-      <w:proofErr w:type="spellEnd"/>
-      <w:r>
-        <w:rPr>
-          <w:rFonts w:ascii="Times New Roman" w:eastAsia="Times New Roman" w:hAnsi="Times New Roman" w:cs="Times New Roman"/>
-          <w:sz w:val="24"/>
-          <w:szCs w:val="24"/>
-        </w:rPr>
-        <w:t xml:space="preserve">. (2023). Online peer feedback in higher education: A synthesis of </w:t>
-      </w:r>
-      <w:proofErr w:type="gramStart"/>
-      <w:r>
-        <w:rPr>
-          <w:rFonts w:ascii="Times New Roman" w:eastAsia="Times New Roman" w:hAnsi="Times New Roman" w:cs="Times New Roman"/>
-          <w:sz w:val="24"/>
-          <w:szCs w:val="24"/>
-        </w:rPr>
-        <w:t>the literature</w:t>
-      </w:r>
-      <w:proofErr w:type="gramEnd"/>
-      <w:r>
-        <w:rPr>
-          <w:rFonts w:ascii="Times New Roman" w:eastAsia="Times New Roman" w:hAnsi="Times New Roman" w:cs="Times New Roman"/>
-          <w:sz w:val="24"/>
-          <w:szCs w:val="24"/>
-        </w:rPr>
-        <w:t xml:space="preserve">. </w:t>
-      </w:r>
-      <w:r>
-        <w:rPr>
-          <w:rFonts w:ascii="Times New Roman" w:eastAsia="Times New Roman" w:hAnsi="Times New Roman" w:cs="Times New Roman"/>
-          <w:i/>
-          <w:iCs/>
-          <w:sz w:val="24"/>
-          <w:szCs w:val="24"/>
-        </w:rPr>
-        <w:t>Education and Information Technologies</w:t>
-      </w:r>
-      <w:r>
-        <w:rPr>
-          <w:rFonts w:ascii="Times New Roman" w:eastAsia="Times New Roman" w:hAnsi="Times New Roman" w:cs="Times New Roman"/>
-          <w:sz w:val="24"/>
-          <w:szCs w:val="24"/>
-        </w:rPr>
-        <w:t xml:space="preserve">, </w:t>
-      </w:r>
-      <w:r>
-        <w:rPr>
-          <w:rFonts w:ascii="Times New Roman" w:eastAsia="Times New Roman" w:hAnsi="Times New Roman" w:cs="Times New Roman"/>
-          <w:i/>
-          <w:iCs/>
-          <w:sz w:val="24"/>
-          <w:szCs w:val="24"/>
-        </w:rPr>
-        <w:t>29</w:t>
-      </w:r>
-      <w:r>
-        <w:rPr>
-          <w:rFonts w:ascii="Times New Roman" w:eastAsia="Times New Roman" w:hAnsi="Times New Roman" w:cs="Times New Roman"/>
-          <w:sz w:val="24"/>
-          <w:szCs w:val="24"/>
-        </w:rPr>
-        <w:t>. https://doi.org/10.1007/s10639-023-12273-8</w:t>
-      </w:r>
-    </w:p>
-    <w:p>
-      <w:pPr>
-        <w:spacing w:line="480" w:lineRule="auto"/>
-        <w:ind w:left="850" w:hanging="850"/>
-        <w:rPr>
-          <w:rFonts w:ascii="Times New Roman" w:eastAsia="Times New Roman" w:hAnsi="Times New Roman" w:cs="Times New Roman"/>
-          <w:sz w:val="24"/>
-          <w:szCs w:val="24"/>
-        </w:rPr>
-      </w:pPr>
-      <w:r>
-        <w:rPr>
-          <w:rFonts w:ascii="Times New Roman" w:eastAsia="Times New Roman" w:hAnsi="Times New Roman" w:cs="Times New Roman"/>
-          <w:sz w:val="24"/>
-          <w:szCs w:val="24"/>
-        </w:rPr>
-        <w:lastRenderedPageBreak/>
-        <w:t xml:space="preserve">Chen, L., Geng, X., Min, L., Shimada, A., &amp; Yamada, M. (2023). How Students Use Learning Analytics Dashboards in Higher Education: A Learning Performance Perspective. </w:t>
-      </w:r>
-      <w:r>
-        <w:rPr>
-          <w:rFonts w:ascii="Times New Roman" w:eastAsia="Times New Roman" w:hAnsi="Times New Roman" w:cs="Times New Roman"/>
-          <w:i/>
-          <w:iCs/>
-          <w:sz w:val="24"/>
-          <w:szCs w:val="24"/>
-        </w:rPr>
-        <w:t>SAGE Open</w:t>
-      </w:r>
-      <w:r>
-        <w:rPr>
-          <w:rFonts w:ascii="Times New Roman" w:eastAsia="Times New Roman" w:hAnsi="Times New Roman" w:cs="Times New Roman"/>
-          <w:sz w:val="24"/>
-          <w:szCs w:val="24"/>
-        </w:rPr>
-        <w:t xml:space="preserve">, </w:t>
-      </w:r>
-      <w:r>
-        <w:rPr>
-          <w:rFonts w:ascii="Times New Roman" w:eastAsia="Times New Roman" w:hAnsi="Times New Roman" w:cs="Times New Roman"/>
-          <w:i/>
-          <w:iCs/>
-          <w:sz w:val="24"/>
-          <w:szCs w:val="24"/>
-        </w:rPr>
-        <w:t>13</w:t>
-      </w:r>
-      <w:r>
-        <w:rPr>
-          <w:rFonts w:ascii="Times New Roman" w:eastAsia="Times New Roman" w:hAnsi="Times New Roman" w:cs="Times New Roman"/>
-          <w:sz w:val="24"/>
-          <w:szCs w:val="24"/>
-        </w:rPr>
-        <w:t xml:space="preserve">(3). </w:t>
-      </w:r>
-      <w:hyperlink r:id="rId6">
-        <w:r>
-          <w:rPr>
-            <w:rFonts w:ascii="Times New Roman" w:eastAsia="Times New Roman" w:hAnsi="Times New Roman" w:cs="Times New Roman"/>
-            <w:color w:val="1155CC"/>
-            <w:sz w:val="24"/>
-            <w:szCs w:val="24"/>
-            <w:u w:val="single"/>
-          </w:rPr>
-          <w:t>https://doi.org/10.1177/21582440231192151</w:t>
-        </w:r>
-      </w:hyperlink>
-    </w:p>
-    <w:p>
-      <w:pPr>
-        <w:spacing w:line="480" w:lineRule="auto"/>
-        <w:ind w:left="720"/>
-        <w:jc w:val="both"/>
-        <w:rPr>
-          <w:rFonts w:ascii="Times New Roman" w:eastAsia="Times New Roman" w:hAnsi="Times New Roman" w:cs="Times New Roman"/>
-          <w:sz w:val="24"/>
-          <w:szCs w:val="24"/>
-        </w:rPr>
-      </w:pPr>
-      <w:r>
-        <w:rPr>
-          <w:rFonts w:ascii="Times New Roman" w:eastAsia="Times New Roman" w:hAnsi="Times New Roman" w:cs="Times New Roman"/>
-          <w:sz w:val="24"/>
-          <w:szCs w:val="24"/>
-        </w:rPr>
-        <w:t>Document Management</w:t>
-      </w:r>
-    </w:p>
-    <w:p>
-      <w:pPr>
-        <w:spacing w:line="480" w:lineRule="auto"/>
-        <w:ind w:left="720"/>
-        <w:jc w:val="both"/>
-        <w:rPr>
-          <w:rFonts w:ascii="Times New Roman" w:eastAsia="Times New Roman" w:hAnsi="Times New Roman" w:cs="Times New Roman"/>
-          <w:sz w:val="24"/>
-          <w:szCs w:val="24"/>
-        </w:rPr>
-      </w:pPr>
-      <w:r>
-        <w:rPr>
-          <w:rFonts w:ascii="Times New Roman" w:eastAsia="Times New Roman" w:hAnsi="Times New Roman" w:cs="Times New Roman"/>
-          <w:sz w:val="24"/>
-          <w:szCs w:val="24"/>
-        </w:rPr>
-        <w:t xml:space="preserve"> </w:t>
       </w:r>
     </w:p>
     <w:p>

</xml_diff>